<commit_message>
Refresh handbook from the web page
Published directly by a manual refresh; the test suite ran first.

 output/graduate-handbook.docx | Bin 125594 -> 136804 bytes
 output/graduate-handbook.pdf  | Bin 324546 -> 324806 bytes
 snapshot/handbook.md          |   4 ++--
 3 files changed, 2 insertions(+), 2 deletions(-)
</commit_message>
<xml_diff>
--- a/output/graduate-handbook.docx
+++ b/output/graduate-handbook.docx
@@ -9068,48 +9068,18 @@
       </w:pPr>
       <w:r>
         <w:rPr>
-          <w:rFonts w:asciiTheme="majorHAnsi" w:hAnsiTheme="majorHAnsi" w:cstheme="majorHAnsi"/>
           <w:color w:val="EE0000"/>
           <w:sz w:val="24"/>
-          <w:szCs w:val="24"/>
-        </w:rPr>
-        <w:t xml:space="preserve">Chair, Professor </w:t>
-      </w:r>
-      <w:r>
-        <w:rPr>
-          <w:rFonts w:asciiTheme="majorHAnsi" w:hAnsiTheme="majorHAnsi" w:cstheme="majorHAnsi"/>
-          <w:color w:val="EE0000"/>
-          <w:sz w:val="24"/>
-          <w:szCs w:val="24"/>
-        </w:rPr>
-        <w:t>Mete Soner</w:t>
-      </w:r>
-      <w:r>
-        <w:rPr>
-          <w:rFonts w:asciiTheme="majorHAnsi" w:hAnsiTheme="majorHAnsi" w:cstheme="majorHAnsi"/>
-          <w:color w:val="EE0000"/>
-          <w:sz w:val="24"/>
-          <w:szCs w:val="24"/>
-        </w:rPr>
-        <w:t xml:space="preserve">, </w:t>
-      </w:r>
-      <w:r>
-        <w:rPr>
-          <w:rFonts w:asciiTheme="majorHAnsi" w:hAnsiTheme="majorHAnsi" w:cstheme="majorHAnsi"/>
-          <w:color w:val="EE0000"/>
-          <w:sz w:val="24"/>
-          <w:szCs w:val="24"/>
-        </w:rPr>
-        <w:t>609-258-</w:t>
-      </w:r>
-      <w:r>
-        <w:rPr>
-          <w:rFonts w:asciiTheme="majorHAnsi" w:hAnsiTheme="majorHAnsi" w:cstheme="majorHAnsi"/>
-          <w:color w:val="EE0000"/>
-          <w:sz w:val="24"/>
-          <w:szCs w:val="24"/>
-        </w:rPr>
-        <w:t>5130</w:t>
+        </w:rPr>
+        <w:t xml:space="preserve">Chair, </w:t>
+      </w:r>
+      <w:r>
+        <w:rPr>
+          <w:color w:val="0000FF"/>
+          <w:sz w:val="24"/>
+          <w:u w:val="single"/>
+        </w:rPr>
+        <w:t>Professor Amir Ali Ahmadi</w:t>
       </w:r>
     </w:p>
     <w:p>

</xml_diff>

<commit_message>
Give body pages a real margin; fix hidden emails and stale links
The template sets top and bottom margins to zero and relied on blank lines at the top of each page, which the rule-based pagination removes, so body text started at the page edge. The cover (designed around the zero margin) is now its own section with the template's setup; the rest gets 1-inch margins, with page numbering continuing at 2.

Cloudflare served '[email protected]' placeholders to the scraper, and the handbook printed them; addresses are now decoded. Rewritten paragraphs kept the template's hyperlinks, which prefixed the new text ('http://www.princeton.edu/tigerhubPayroll checks...'); those are cleared, and web links become real hyperlinks.
</commit_message>
<xml_diff>
--- a/output/graduate-handbook.docx
+++ b/output/graduate-handbook.docx
@@ -502,7 +502,7 @@
               <w:rPr>
                 <w:color w:val="000000"/>
               </w:rPr>
-              <w:t>4</w:t>
+              <w:t>5</w:t>
             </w:r>
           </w:hyperlink>
         </w:p>
@@ -590,7 +590,7 @@
               <w:color w:val="000000"/>
             </w:rPr>
             <w:tab/>
-            <w:t>6</w:t>
+            <w:t>7</w:t>
           </w:r>
         </w:p>
         <w:p>
@@ -642,7 +642,7 @@
               <w:color w:val="000000"/>
             </w:rPr>
             <w:tab/>
-            <w:t>6</w:t>
+            <w:t>7</w:t>
           </w:r>
         </w:p>
         <w:p>
@@ -752,7 +752,7 @@
               <w:rPr>
                 <w:color w:val="000000"/>
               </w:rPr>
-              <w:t>7</w:t>
+              <w:t>8</w:t>
             </w:r>
           </w:hyperlink>
         </w:p>
@@ -872,7 +872,7 @@
                 <w:color w:val="000000"/>
               </w:rPr>
               <w:tab/>
-              <w:t>9</w:t>
+              <w:t>10</w:t>
             </w:r>
           </w:hyperlink>
         </w:p>
@@ -916,7 +916,7 @@
               <w:tab/>
             </w:r>
             <w:r>
-              <w:t>9</w:t>
+              <w:t>10</w:t>
             </w:r>
           </w:hyperlink>
         </w:p>
@@ -969,7 +969,7 @@
               <w:rPr>
                 <w:color w:val="000000"/>
               </w:rPr>
-              <w:t>9</w:t>
+              <w:t>10</w:t>
             </w:r>
           </w:hyperlink>
         </w:p>
@@ -1022,7 +1022,7 @@
               <w:rPr>
                 <w:color w:val="000000"/>
               </w:rPr>
-              <w:t>9</w:t>
+              <w:t>10</w:t>
             </w:r>
           </w:hyperlink>
         </w:p>
@@ -1081,7 +1081,7 @@
               <w:rPr>
                 <w:color w:val="000000"/>
               </w:rPr>
-              <w:t>10</w:t>
+              <w:t>11</w:t>
             </w:r>
           </w:hyperlink>
         </w:p>
@@ -1139,7 +1139,7 @@
               <w:rPr>
                 <w:color w:val="000000"/>
               </w:rPr>
-              <w:t>10</w:t>
+              <w:t>11</w:t>
             </w:r>
           </w:hyperlink>
         </w:p>
@@ -1192,7 +1192,7 @@
               <w:rPr>
                 <w:color w:val="000000"/>
               </w:rPr>
-              <w:t>10</w:t>
+              <w:t>11</w:t>
             </w:r>
           </w:hyperlink>
         </w:p>
@@ -1245,7 +1245,7 @@
               <w:rPr>
                 <w:color w:val="000000"/>
               </w:rPr>
-              <w:t>10</w:t>
+              <w:t>11</w:t>
             </w:r>
           </w:hyperlink>
         </w:p>
@@ -1291,13 +1291,13 @@
             <w:rPr>
               <w:color w:val="000000"/>
             </w:rPr>
-            <w:t>1</w:t>
+            <w:t>12</w:t>
           </w:r>
           <w:r>
             <w:rPr>
               <w:color w:val="000000"/>
             </w:rPr>
-            <w:t>0</w:t>
+            <w:t/>
           </w:r>
           <w:r>
             <w:rPr>
@@ -1338,7 +1338,7 @@
               <w:color w:val="000000"/>
             </w:rPr>
             <w:tab/>
-            <w:t>11</w:t>
+            <w:t>12</w:t>
           </w:r>
           <w:r>
             <w:rPr>
@@ -1400,7 +1400,7 @@
               <w:rPr>
                 <w:color w:val="000000"/>
               </w:rPr>
-              <w:t>12</w:t>
+              <w:t>13</w:t>
             </w:r>
             <w:r>
               <w:rPr>
@@ -1453,7 +1453,7 @@
                 <w:color w:val="000000"/>
               </w:rPr>
               <w:tab/>
-              <w:t>13</w:t>
+              <w:t>14</w:t>
             </w:r>
           </w:hyperlink>
           <w:r>
@@ -1480,67 +1480,16 @@
     </w:sdt>
     <w:p>
       <w:pPr>
-        <w:widowControl w:val="0"/>
-        <w:pBdr>
-          <w:top w:val="nil"/>
-          <w:left w:val="nil"/>
-          <w:bottom w:val="nil"/>
-          <w:right w:val="nil"/>
-          <w:between w:val="nil"/>
-        </w:pBdr>
-        <w:spacing w:after="0"/>
-      </w:pPr>
-      <w:r>
-        <w:t xml:space="preserve">   </w:t>
-      </w:r>
-      <w:r>
-        <w:tab/>
-      </w:r>
-      <w:r>
-        <w:tab/>
-      </w:r>
-      <w:r>
-        <w:tab/>
-      </w:r>
-      <w:r>
-        <w:tab/>
-      </w:r>
-      <w:r>
-        <w:tab/>
-      </w:r>
-      <w:r>
-        <w:tab/>
-      </w:r>
-      <w:r>
-        <w:tab/>
-      </w:r>
-      <w:r>
-        <w:tab/>
-        <w:t xml:space="preserve">          </w:t>
-      </w:r>
-    </w:p>
-    <w:p>
-      <w:pPr>
-        <w:pStyle w:val="Heading2"/>
-        <w:rPr>
-          <w:color w:val="000000"/>
-        </w:rPr>
-      </w:pPr>
-    </w:p>
-    <w:p>
-      <w:pPr>
-        <w:pStyle w:val="Heading2"/>
-        <w:rPr>
-          <w:color w:val="000000"/>
-        </w:rPr>
-      </w:pPr>
-      <w:bookmarkStart w:id="1" w:name="_30j0zll" w:colFirst="0" w:colLast="0"/>
-      <w:bookmarkEnd w:id="1"/>
-    </w:p>
-    <w:p/>
-    <w:p/>
-    <w:p/>
-    <w:p/>
+        <w:sectPr>
+          <w:footerReference w:type="default" r:id="rId21"/>
+          <w:pgSz w:w="12240" w:h="15840"/>
+          <w:pgMar w:top="0" w:right="1440" w:bottom="0" w:left="1440" w:header="720" w:footer="720" w:gutter="0"/>
+          <w:pgNumType w:start="1"/>
+          <w:cols w:space="720"/>
+          <w:titlePg/>
+        </w:sectPr>
+      </w:pPr>
+    </w:p>
     <w:p>
       <w:pPr>
         <w:pStyle w:val="Heading2"/>
@@ -6234,14 +6183,16 @@
         </w:rPr>
         <w:t xml:space="preserve">The readers and FPO examiners must be approved first by the ORFE department chair, and then by the Graduate School. The first reader is the principal adviser, and the second reader is an ORFE faculty member. An FPO examination committee and readers approval request must be submitted to the Department Chair’s office. Please </w:t>
       </w:r>
-      <w:r>
-        <w:rPr>
-          <w:color w:val="0000FF"/>
-          <w:sz w:val="24"/>
-          <w:u w:val="single"/>
-        </w:rPr>
-        <w:t>submit the request at least two months before the anticipated FPO date to Kimberly Lupinacci in the Graduate Administrator’s office</w:t>
-      </w:r>
+      <w:hyperlink r:id="rId24">
+        <w:r>
+          <w:rPr>
+            <w:color w:val="0000FF"/>
+            <w:sz w:val="24"/>
+            <w:u w:val="single"/>
+          </w:rPr>
+          <w:t>submit the request at least two months before the anticipated FPO date to Kimberly Lupinacci in the Graduate Administrator’s office</w:t>
+        </w:r>
+      </w:hyperlink>
       <w:r>
         <w:rPr>
           <w:sz w:val="24"/>
@@ -7914,13 +7865,15 @@
         </w:rPr>
         <w:t xml:space="preserve"> by your adviser, or by the DGS for 1st year students without an adviser.  You are responsible for </w:t>
       </w:r>
-      <w:r>
-        <w:rPr>
-          <w:color w:val="0000FF"/>
-          <w:u w:val="single"/>
-        </w:rPr>
-        <w:t>submitting a request</w:t>
-      </w:r>
+      <w:hyperlink r:id="rId13">
+        <w:r>
+          <w:rPr>
+            <w:color w:val="0000FF"/>
+            <w:u w:val="single"/>
+          </w:rPr>
+          <w:t>submitting a request</w:t>
+        </w:r>
+      </w:hyperlink>
       <w:r>
         <w:rPr>
           <w:color w:val="FF0000"/>
@@ -7952,14 +7905,16 @@
         </w:rPr>
         <w:t xml:space="preserve">Please visit the </w:t>
       </w:r>
-      <w:r>
-        <w:rPr>
-          <w:color w:val="0000FF"/>
-          <w:sz w:val="24"/>
-          <w:u w:val="single"/>
-        </w:rPr>
-        <w:t>Registrar</w:t>
-      </w:r>
+      <w:hyperlink r:id="rId25">
+        <w:r>
+          <w:rPr>
+            <w:color w:val="0000FF"/>
+            <w:sz w:val="24"/>
+            <w:u w:val="single"/>
+          </w:rPr>
+          <w:t>Registrar</w:t>
+        </w:r>
+      </w:hyperlink>
       <w:r>
         <w:rPr>
           <w:color w:val="000000"/>
@@ -8493,31 +8448,23 @@
           <w:szCs w:val="24"/>
         </w:rPr>
       </w:pPr>
-      <w:hyperlink r:id="rId19" w:history="1">
+      <w:r>
+        <w:rPr>
+          <w:color w:val="000000"/>
+          <w:sz w:val="24"/>
+        </w:rPr>
+        <w:t xml:space="preserve">Graduate Student Affairs Office is 120 - Sherrerd Hall, extension 8-4018, </w:t>
+      </w:r>
+      <w:hyperlink r:id="rId19">
         <w:r>
           <w:rPr>
-            <w:rStyle w:val="Hyperlink"/>
-            <w:rFonts w:asciiTheme="majorHAnsi" w:hAnsiTheme="majorHAnsi" w:cstheme="majorHAnsi"/>
+            <w:color w:val="0000FF"/>
             <w:sz w:val="24"/>
-            <w:szCs w:val="24"/>
+            <w:u w:val="single"/>
           </w:rPr>
           <w:t>klupinac@princeton.edu</w:t>
         </w:r>
       </w:hyperlink>
-      <w:r>
-        <w:rPr>
-          <w:color w:val="000000"/>
-          <w:sz w:val="24"/>
-        </w:rPr>
-        <w:t xml:space="preserve">Graduate Student Affairs Office is 120 - Sherrerd Hall, extension 8-4018, </w:t>
-      </w:r>
-      <w:r>
-        <w:rPr>
-          <w:color w:val="000000"/>
-          <w:sz w:val="24"/>
-        </w:rPr>
-        <w:t>[email protected]</w:t>
-      </w:r>
     </w:p>
     <w:p>
       <w:pPr>
@@ -8573,33 +8520,23 @@
           <w:szCs w:val="24"/>
         </w:rPr>
       </w:pPr>
+      <w:r>
+        <w:rPr>
+          <w:color w:val="000000"/>
+          <w:sz w:val="24"/>
+        </w:rPr>
+        <w:t xml:space="preserve">Payroll checks are put in your mailbox on the last working day of the month. Go Green! Sign up for direct deposit via </w:t>
+      </w:r>
       <w:hyperlink r:id="rId20">
         <w:r>
           <w:rPr>
-            <w:rFonts w:asciiTheme="majorHAnsi" w:hAnsiTheme="majorHAnsi" w:cstheme="majorHAnsi"/>
             <w:color w:val="0000FF"/>
             <w:sz w:val="24"/>
-            <w:szCs w:val="24"/>
             <w:u w:val="single"/>
           </w:rPr>
-          <w:t>http://www.princeton.edu/tigerhub</w:t>
+          <w:t>TigerHub</w:t>
         </w:r>
       </w:hyperlink>
-      <w:r>
-        <w:rPr>
-          <w:color w:val="000000"/>
-          <w:sz w:val="24"/>
-        </w:rPr>
-        <w:t xml:space="preserve">Payroll checks are put in your mailbox on the last working day of the month. Go Green! Sign up for direct deposit via </w:t>
-      </w:r>
-      <w:r>
-        <w:rPr>
-          <w:color w:val="0000FF"/>
-          <w:sz w:val="24"/>
-          <w:u w:val="single"/>
-        </w:rPr>
-        <w:t>TigerHub</w:t>
-      </w:r>
       <w:r>
         <w:rPr>
           <w:color w:val="000000"/>
@@ -8884,14 +8821,16 @@
         </w:rPr>
         <w:t xml:space="preserve">Chair, </w:t>
       </w:r>
-      <w:r>
-        <w:rPr>
-          <w:color w:val="0000FF"/>
-          <w:sz w:val="24"/>
-          <w:u w:val="single"/>
-        </w:rPr>
-        <w:t>Professor Amir Ali Ahmadi</w:t>
-      </w:r>
+      <w:hyperlink r:id="rId26">
+        <w:r>
+          <w:rPr>
+            <w:color w:val="0000FF"/>
+            <w:sz w:val="24"/>
+            <w:u w:val="single"/>
+          </w:rPr>
+          <w:t>Professor Amir Ali Ahmadi</w:t>
+        </w:r>
+      </w:hyperlink>
     </w:p>
     <w:p>
       <w:pPr>
@@ -9249,10 +9188,9 @@
     <w:sectPr>
       <w:footerReference w:type="default" r:id="rId21"/>
       <w:pgSz w:w="12240" w:h="15840"/>
-      <w:pgMar w:top="0" w:right="1440" w:bottom="0" w:left="1440" w:header="720" w:footer="720" w:gutter="0"/>
-      <w:pgNumType w:start="1"/>
+      <w:pgMar w:top="1440" w:right="1440" w:bottom="1440" w:left="1440" w:header="720" w:footer="720" w:gutter="0"/>
+      <w:pgNumType w:start="2"/>
       <w:cols w:space="720"/>
-      <w:titlePg/>
     </w:sectPr>
   </w:body>
 </w:document>

</xml_diff>

<commit_message>
Refresh handbook from the web page (#7)
output/graduate-handbook.docx | Bin 124675 -> 124686 bytes
 output/graduate-handbook.pdf  | Bin 321408 -> 322687 bytes
 snapshot/handbook.md          |   6 +++---
 3 files changed, 3 insertions(+), 3 deletions(-)

Co-authored-by: github-actions[bot] <41898282+github-actions[bot]@users.noreply.github.com>
</commit_message>
<xml_diff>
--- a/output/graduate-handbook.docx
+++ b/output/graduate-handbook.docx
@@ -8855,146 +8855,102 @@
       </w:pPr>
       <w:r>
         <w:rPr>
-          <w:rFonts w:asciiTheme="majorHAnsi" w:hAnsiTheme="majorHAnsi" w:cstheme="majorHAnsi"/>
-          <w:sz w:val="24"/>
-          <w:szCs w:val="24"/>
-        </w:rPr>
-        <w:t xml:space="preserve">Director of Graduate Studies, Professor </w:t>
-      </w:r>
-      <w:r>
-        <w:rPr>
-          <w:rFonts w:asciiTheme="majorHAnsi" w:hAnsiTheme="majorHAnsi" w:cstheme="majorHAnsi"/>
-          <w:sz w:val="24"/>
-          <w:szCs w:val="24"/>
-        </w:rPr>
-        <w:t>Ludovic Tangpi</w:t>
-      </w:r>
-      <w:r>
-        <w:rPr>
-          <w:rFonts w:asciiTheme="majorHAnsi" w:hAnsiTheme="majorHAnsi" w:cstheme="majorHAnsi"/>
-          <w:sz w:val="24"/>
-          <w:szCs w:val="24"/>
-        </w:rPr>
-        <w:t>, 609-</w:t>
-      </w:r>
-      <w:r>
-        <w:rPr>
-          <w:rFonts w:asciiTheme="majorHAnsi" w:hAnsiTheme="majorHAnsi" w:cstheme="majorHAnsi"/>
-          <w:sz w:val="24"/>
-          <w:szCs w:val="24"/>
-        </w:rPr>
-        <w:t>258-</w:t>
-      </w:r>
-      <w:r>
-        <w:rPr>
-          <w:rFonts w:asciiTheme="majorHAnsi" w:hAnsiTheme="majorHAnsi" w:cstheme="majorHAnsi"/>
-          <w:sz w:val="24"/>
-          <w:szCs w:val="24"/>
-        </w:rPr>
-        <w:t>4558</w:t>
-      </w:r>
-    </w:p>
-    <w:p>
-      <w:pPr>
-        <w:widowControl/>
-        <w:spacing w:after="0" w:line="240" w:lineRule="auto"/>
-        <w:rPr>
-          <w:rFonts w:asciiTheme="majorHAnsi" w:hAnsiTheme="majorHAnsi" w:cstheme="majorHAnsi"/>
-          <w:color w:val="000000"/>
-          <w:sz w:val="24"/>
-          <w:szCs w:val="24"/>
-        </w:rPr>
-      </w:pPr>
-    </w:p>
-    <w:p>
-      <w:pPr>
-        <w:widowControl/>
-        <w:spacing w:after="0" w:line="240" w:lineRule="auto"/>
-        <w:rPr>
-          <w:rFonts w:asciiTheme="majorHAnsi" w:hAnsiTheme="majorHAnsi" w:cstheme="majorHAnsi"/>
-          <w:color w:val="000000"/>
-          <w:sz w:val="24"/>
-          <w:szCs w:val="24"/>
-        </w:rPr>
-      </w:pPr>
-      <w:r>
-        <w:rPr>
-          <w:rFonts w:asciiTheme="majorHAnsi" w:hAnsiTheme="majorHAnsi" w:cstheme="majorHAnsi"/>
-          <w:color w:val="000000"/>
-          <w:sz w:val="24"/>
-          <w:szCs w:val="24"/>
-        </w:rPr>
-        <w:t xml:space="preserve">Department Manager, Connie Brown, </w:t>
-      </w:r>
-      <w:r>
-        <w:rPr>
-          <w:rFonts w:asciiTheme="majorHAnsi" w:hAnsiTheme="majorHAnsi" w:cstheme="majorHAnsi"/>
-          <w:color w:val="000000"/>
-          <w:sz w:val="24"/>
-          <w:szCs w:val="24"/>
-        </w:rPr>
-        <w:t>609-258-</w:t>
-      </w:r>
-      <w:r>
-        <w:rPr>
-          <w:rFonts w:asciiTheme="majorHAnsi" w:hAnsiTheme="majorHAnsi" w:cstheme="majorHAnsi"/>
-          <w:color w:val="000000"/>
-          <w:sz w:val="24"/>
-          <w:szCs w:val="24"/>
-        </w:rPr>
-        <w:t>5422</w:t>
-      </w:r>
-    </w:p>
-    <w:p>
-      <w:pPr>
-        <w:widowControl/>
-        <w:spacing w:after="0" w:line="240" w:lineRule="auto"/>
-        <w:rPr>
-          <w:rFonts w:asciiTheme="majorHAnsi" w:hAnsiTheme="majorHAnsi" w:cstheme="majorHAnsi"/>
-          <w:color w:val="000000"/>
-          <w:sz w:val="24"/>
-          <w:szCs w:val="24"/>
-        </w:rPr>
-      </w:pPr>
-    </w:p>
-    <w:p>
-      <w:pPr>
-        <w:widowControl/>
-        <w:spacing w:after="0" w:line="240" w:lineRule="auto"/>
-        <w:rPr>
-          <w:rFonts w:asciiTheme="majorHAnsi" w:hAnsiTheme="majorHAnsi" w:cstheme="majorHAnsi"/>
-          <w:color w:val="000000"/>
-          <w:sz w:val="24"/>
-          <w:szCs w:val="24"/>
-        </w:rPr>
-      </w:pPr>
-      <w:r>
-        <w:rPr>
-          <w:rFonts w:asciiTheme="majorHAnsi" w:hAnsiTheme="majorHAnsi" w:cstheme="majorHAnsi"/>
-          <w:color w:val="000000"/>
-          <w:sz w:val="24"/>
-          <w:szCs w:val="24"/>
-        </w:rPr>
-        <w:t xml:space="preserve">Graduate Program Administrator, Kimberly Lupinacci, </w:t>
-      </w:r>
-      <w:r>
-        <w:rPr>
-          <w:rFonts w:asciiTheme="majorHAnsi" w:hAnsiTheme="majorHAnsi" w:cstheme="majorHAnsi"/>
-          <w:color w:val="000000"/>
-          <w:sz w:val="24"/>
-          <w:szCs w:val="24"/>
-        </w:rPr>
-        <w:t>609-258-</w:t>
-      </w:r>
-      <w:r>
-        <w:rPr>
-          <w:rFonts w:asciiTheme="majorHAnsi" w:hAnsiTheme="majorHAnsi" w:cstheme="majorHAnsi"/>
-          <w:color w:val="000000"/>
-          <w:sz w:val="24"/>
-          <w:szCs w:val="24"/>
-        </w:rPr>
-        <w:t>4018</w:t>
-      </w:r>
+          <w:sz w:val="24"/>
+        </w:rPr>
+        <w:t xml:space="preserve">Director of Graduate Studies, </w:t>
+      </w:r>
+      <w:hyperlink r:id="rId27">
+        <w:r>
+          <w:rPr>
+            <w:color w:val="0000FF"/>
+            <w:sz w:val="24"/>
+            <w:u w:val="single"/>
+          </w:rPr>
+          <w:t>Professor Ludovic Tangpi</w:t>
+        </w:r>
+      </w:hyperlink>
+    </w:p>
+    <w:p>
+      <w:pPr>
+        <w:widowControl/>
+        <w:spacing w:after="0" w:line="240" w:lineRule="auto"/>
+        <w:rPr>
+          <w:rFonts w:asciiTheme="majorHAnsi" w:hAnsiTheme="majorHAnsi" w:cstheme="majorHAnsi"/>
+          <w:color w:val="000000"/>
+          <w:sz w:val="24"/>
+          <w:szCs w:val="24"/>
+        </w:rPr>
+      </w:pPr>
+    </w:p>
+    <w:p>
+      <w:pPr>
+        <w:widowControl/>
+        <w:spacing w:after="0" w:line="240" w:lineRule="auto"/>
+        <w:rPr>
+          <w:rFonts w:asciiTheme="majorHAnsi" w:hAnsiTheme="majorHAnsi" w:cstheme="majorHAnsi"/>
+          <w:color w:val="000000"/>
+          <w:sz w:val="24"/>
+          <w:szCs w:val="24"/>
+        </w:rPr>
+      </w:pPr>
+      <w:r>
+        <w:rPr>
+          <w:color w:val="000000"/>
+          <w:sz w:val="24"/>
+        </w:rPr>
+        <w:t xml:space="preserve">Department Manager, </w:t>
+      </w:r>
+      <w:hyperlink r:id="rId28">
+        <w:r>
+          <w:rPr>
+            <w:color w:val="0000FF"/>
+            <w:sz w:val="24"/>
+            <w:u w:val="single"/>
+          </w:rPr>
+          <w:t>Connie Brown</w:t>
+        </w:r>
+      </w:hyperlink>
+    </w:p>
+    <w:p>
+      <w:pPr>
+        <w:widowControl/>
+        <w:spacing w:after="0" w:line="240" w:lineRule="auto"/>
+        <w:rPr>
+          <w:rFonts w:asciiTheme="majorHAnsi" w:hAnsiTheme="majorHAnsi" w:cstheme="majorHAnsi"/>
+          <w:color w:val="000000"/>
+          <w:sz w:val="24"/>
+          <w:szCs w:val="24"/>
+        </w:rPr>
+      </w:pPr>
+    </w:p>
+    <w:p>
+      <w:pPr>
+        <w:widowControl/>
+        <w:spacing w:after="0" w:line="240" w:lineRule="auto"/>
+        <w:rPr>
+          <w:rFonts w:asciiTheme="majorHAnsi" w:hAnsiTheme="majorHAnsi" w:cstheme="majorHAnsi"/>
+          <w:color w:val="000000"/>
+          <w:sz w:val="24"/>
+          <w:szCs w:val="24"/>
+        </w:rPr>
+      </w:pPr>
+      <w:r>
+        <w:rPr>
+          <w:color w:val="000000"/>
+          <w:sz w:val="24"/>
+        </w:rPr>
+        <w:t xml:space="preserve">Graduate Program Administrator, </w:t>
+      </w:r>
+      <w:hyperlink r:id="rId29">
+        <w:r>
+          <w:rPr>
+            <w:color w:val="0000FF"/>
+            <w:sz w:val="24"/>
+            <w:u w:val="single"/>
+          </w:rPr>
+          <w:t>Kimberly Lupinacci</w:t>
+        </w:r>
+      </w:hyperlink>
     </w:p>
     <w:p>
       <w:pPr>

</xml_diff>